<commit_message>
update WIS2 Guide INFCOM build
</commit_message>
<xml_diff>
--- a/guide/infcom/guide/wis2-guide-DRAFT-INFCOM-4.docx
+++ b/guide/infcom/guide/wis2-guide-DRAFT-INFCOM-4.docx
@@ -105,7 +105,7 @@
         <w:pStyle w:val="Date"/>
       </w:pPr>
       <w:r>
-        <w:t xml:space="preserve">2026-08-21</w:t>
+        <w:t xml:space="preserve">2026-10-01</w:t>
       </w:r>
     </w:p>
     <w:p>
@@ -158,7 +158,7 @@
               <w:jc w:val="left"/>
             </w:pPr>
             <w:r>
-              <w:t xml:space="preserve">Date: 2026-08-21</w:t>
+              <w:t xml:space="preserve">Date: 2026-10-01</w:t>
             </w:r>
           </w:p>
         </w:tc>
@@ -7519,7 +7519,7 @@
         <w:t xml:space="preserve">Manual on WIS</w:t>
       </w:r>
       <w:r>
-        <w:t xml:space="preserve">, Volume II - Appendix E. WIS2 Notification Message) and be a near-identical copy of the original notification message the Global Cache is processing with the following changes: (i) A new unique message ID is used; (ii) A</w:t>
+        <w:t xml:space="preserve">, Volume II - Appendix E. WIS2 Notification Message) and be a near-identical copy of the original notification message the Global Cache is processing with the following changes: (i) A new unique message identifier is used; (ii) A</w:t>
       </w:r>
       <w:r>
         <w:t xml:space="preserve"> </w:t>
@@ -11581,6 +11581,17 @@
       </w:pPr>
       <w:r>
         <w:t xml:space="preserve">A Global Replay shall use the notification message and monitoring event identifier to deduplicate notifications and events.</w:t>
+      </w:r>
+    </w:p>
+    <w:p>
+      <w:pPr>
+        <w:numPr>
+          <w:ilvl w:val="0"/>
+          <w:numId w:val="1080"/>
+        </w:numPr>
+      </w:pPr>
+      <w:r>
+        <w:t xml:space="preserve">A Global Replay will publish notification messages and monitoring events using a near-identical copy of the original notification message or monitoring event with a new unique identifier.</w:t>
       </w:r>
     </w:p>
     <w:p>

</xml_diff>